<commit_message>
Upload files to "Doc"
update test manual that add specification about setting system firewall for nodes that deployed on different hosts.
</commit_message>
<xml_diff>
--- a/Doc/chainnode 系统测试说明.docx
+++ b/Doc/chainnode 系统测试说明.docx
@@ -1,10 +1,10 @@
 
 <file path=word/document.xml><?xml version="1.0" encoding="utf-8"?>
-<w:document xmlns:wpc="http://schemas.microsoft.com/office/word/2010/wordprocessingCanvas" xmlns:cx="http://schemas.microsoft.com/office/drawing/2014/chartex" xmlns:mc="http://schemas.openxmlformats.org/markup-compatibility/2006" xmlns:o="urn:schemas-microsoft-com:office:office" xmlns:r="http://schemas.openxmlformats.org/officeDocument/2006/relationships" xmlns:m="http://schemas.openxmlformats.org/officeDocument/2006/math" xmlns:v="urn:schemas-microsoft-com:vml" xmlns:wp14="http://schemas.microsoft.com/office/word/2010/wordprocessingDrawing" xmlns:wp="http://schemas.openxmlformats.org/drawingml/2006/wordprocessingDrawing" xmlns:w10="urn:schemas-microsoft-com:office:word" xmlns:w="http://schemas.openxmlformats.org/wordprocessingml/2006/main" xmlns:w14="http://schemas.microsoft.com/office/word/2010/wordml" xmlns:w15="http://schemas.microsoft.com/office/word/2012/wordml" xmlns:w16se="http://schemas.microsoft.com/office/word/2015/wordml/symex" xmlns:wpg="http://schemas.microsoft.com/office/word/2010/wordprocessingGroup" xmlns:wpi="http://schemas.microsoft.com/office/word/2010/wordprocessingInk" xmlns:wne="http://schemas.microsoft.com/office/word/2006/wordml" xmlns:wps="http://schemas.microsoft.com/office/word/2010/wordprocessingShape" mc:Ignorable="w14 w15 w16se wp14">
+<w:document xmlns:wpc="http://schemas.microsoft.com/office/word/2010/wordprocessingCanvas" xmlns:cx="http://schemas.microsoft.com/office/drawing/2014/chartex" xmlns:cx1="http://schemas.microsoft.com/office/drawing/2015/9/8/chartex" xmlns:cx2="http://schemas.microsoft.com/office/drawing/2015/10/21/chartex" xmlns:cx3="http://schemas.microsoft.com/office/drawing/2016/5/9/chartex" xmlns:cx4="http://schemas.microsoft.com/office/drawing/2016/5/10/chartex" xmlns:cx5="http://schemas.microsoft.com/office/drawing/2016/5/11/chartex" xmlns:cx6="http://schemas.microsoft.com/office/drawing/2016/5/12/chartex" xmlns:cx7="http://schemas.microsoft.com/office/drawing/2016/5/13/chartex" xmlns:cx8="http://schemas.microsoft.com/office/drawing/2016/5/14/chartex" xmlns:mc="http://schemas.openxmlformats.org/markup-compatibility/2006" xmlns:aink="http://schemas.microsoft.com/office/drawing/2016/ink" xmlns:am3d="http://schemas.microsoft.com/office/drawing/2017/model3d" xmlns:o="urn:schemas-microsoft-com:office:office" xmlns:oel="http://schemas.microsoft.com/office/2019/extlst" xmlns:r="http://schemas.openxmlformats.org/officeDocument/2006/relationships" xmlns:m="http://schemas.openxmlformats.org/officeDocument/2006/math" xmlns:v="urn:schemas-microsoft-com:vml" xmlns:wp14="http://schemas.microsoft.com/office/word/2010/wordprocessingDrawing" xmlns:wp="http://schemas.openxmlformats.org/drawingml/2006/wordprocessingDrawing" xmlns:w10="urn:schemas-microsoft-com:office:word" xmlns:w="http://schemas.openxmlformats.org/wordprocessingml/2006/main" xmlns:w14="http://schemas.microsoft.com/office/word/2010/wordml" xmlns:w15="http://schemas.microsoft.com/office/word/2012/wordml" xmlns:w16cex="http://schemas.microsoft.com/office/word/2018/wordml/cex" xmlns:w16cid="http://schemas.microsoft.com/office/word/2016/wordml/cid" xmlns:w16="http://schemas.microsoft.com/office/word/2018/wordml" xmlns:w16du="http://schemas.microsoft.com/office/word/2023/wordml/word16du" xmlns:w16sdtdh="http://schemas.microsoft.com/office/word/2020/wordml/sdtdatahash" xmlns:w16sdtfl="http://schemas.microsoft.com/office/word/2024/wordml/sdtformatlock" xmlns:w16se="http://schemas.microsoft.com/office/word/2015/wordml/symex" xmlns:wpg="http://schemas.microsoft.com/office/word/2010/wordprocessingGroup" xmlns:wpi="http://schemas.microsoft.com/office/word/2010/wordprocessingInk" xmlns:wne="http://schemas.microsoft.com/office/word/2006/wordml" xmlns:wps="http://schemas.microsoft.com/office/word/2010/wordprocessingShape" mc:Ignorable="w14 w15 w16se w16cid w16 w16cex w16sdtdh w16sdtfl w16du wp14">
   <w:body>
     <w:p>
       <w:pPr>
-        <w:pStyle w:val="1"/>
+        <w:pStyle w:val="Heading1"/>
       </w:pPr>
       <w:r>
         <w:rPr>
@@ -15,7 +15,7 @@
     </w:p>
     <w:tbl>
       <w:tblPr>
-        <w:tblStyle w:val="a3"/>
+        <w:tblStyle w:val="TableGrid"/>
         <w:tblW w:w="0" w:type="auto"/>
         <w:tblLook w:val="04A0" w:firstRow="1" w:lastRow="0" w:firstColumn="1" w:lastColumn="0" w:noHBand="0" w:noVBand="1"/>
       </w:tblPr>
@@ -393,7 +393,7 @@
     <w:p/>
     <w:p>
       <w:pPr>
-        <w:pStyle w:val="1"/>
+        <w:pStyle w:val="Heading1"/>
       </w:pPr>
       <w:r>
         <w:rPr>
@@ -450,7 +450,6 @@
       <w:proofErr w:type="spellEnd"/>
     </w:p>
     <w:p>
-      <w:proofErr w:type="gramStart"/>
       <w:r>
         <w:rPr>
           <w:rFonts w:hint="eastAsia"/>
@@ -458,15 +457,10 @@
         <w:t>│</w:t>
       </w:r>
       <w:r>
-        <w:t xml:space="preserve">  │  </w:t>
-      </w:r>
-      <w:proofErr w:type="gramEnd"/>
-      <w:r>
-        <w:t>AgentGUI.exe</w:t>
-      </w:r>
-    </w:p>
-    <w:p>
-      <w:proofErr w:type="gramStart"/>
+        <w:t xml:space="preserve">  │  AgentGUI.exe</w:t>
+      </w:r>
+    </w:p>
+    <w:p>
       <w:r>
         <w:rPr>
           <w:rFonts w:hint="eastAsia"/>
@@ -474,15 +468,10 @@
         <w:t>│</w:t>
       </w:r>
       <w:r>
-        <w:t xml:space="preserve">  │  </w:t>
-      </w:r>
-      <w:proofErr w:type="gramEnd"/>
-      <w:r>
-        <w:t>config.template.ini</w:t>
-      </w:r>
-    </w:p>
-    <w:p>
-      <w:proofErr w:type="gramStart"/>
+        <w:t xml:space="preserve">  │  config.template.ini</w:t>
+      </w:r>
+    </w:p>
+    <w:p>
       <w:r>
         <w:rPr>
           <w:rFonts w:hint="eastAsia"/>
@@ -490,11 +479,7 @@
         <w:t>│</w:t>
       </w:r>
       <w:r>
-        <w:t xml:space="preserve">  │  </w:t>
-      </w:r>
-      <w:proofErr w:type="gramEnd"/>
-      <w:r>
-        <w:t>nodeagent.exe</w:t>
+        <w:t xml:space="preserve">  │  nodeagent.exe</w:t>
       </w:r>
     </w:p>
     <w:p>
@@ -595,7 +580,6 @@
       </w:r>
     </w:p>
     <w:p>
-      <w:proofErr w:type="spellStart"/>
       <w:r>
         <w:t>I</w:t>
       </w:r>
@@ -603,14 +587,7 @@
         <w:rPr>
           <w:rFonts w:hint="eastAsia"/>
         </w:rPr>
-        <w:t>ni</w:t>
-      </w:r>
-      <w:proofErr w:type="spellEnd"/>
-      <w:r>
-        <w:rPr>
-          <w:rFonts w:hint="eastAsia"/>
-        </w:rPr>
-        <w:t>文件在</w:t>
+        <w:t>ni文件在</w:t>
       </w:r>
       <w:r>
         <w:t>chain\internal</w:t>
@@ -681,7 +658,7 @@
     <w:p/>
     <w:p>
       <w:pPr>
-        <w:pStyle w:val="1"/>
+        <w:pStyle w:val="Heading1"/>
       </w:pPr>
       <w:r>
         <w:rPr>
@@ -692,7 +669,7 @@
     </w:p>
     <w:p>
       <w:pPr>
-        <w:pStyle w:val="a4"/>
+        <w:pStyle w:val="ListParagraph"/>
         <w:numPr>
           <w:ilvl w:val="0"/>
           <w:numId w:val="2"/>
@@ -717,7 +694,7 @@
     </w:p>
     <w:p>
       <w:pPr>
-        <w:pStyle w:val="a4"/>
+        <w:pStyle w:val="ListParagraph"/>
         <w:numPr>
           <w:ilvl w:val="0"/>
           <w:numId w:val="2"/>
@@ -728,17 +705,9 @@
         <w:rPr>
           <w:rFonts w:hint="eastAsia"/>
         </w:rPr>
-        <w:t>模块选择页面如下所示，如果要在单机搭建网络，</w:t>
-      </w:r>
-      <w:proofErr w:type="gramStart"/>
-      <w:r>
-        <w:rPr>
-          <w:rFonts w:hint="eastAsia"/>
-        </w:rPr>
-        <w:t>那么勾选</w:t>
-      </w:r>
-      <w:proofErr w:type="spellStart"/>
-      <w:proofErr w:type="gramEnd"/>
+        <w:t>模块选择页面如下所示，如果要在单机搭建网络，那么勾选</w:t>
+      </w:r>
+      <w:proofErr w:type="spellStart"/>
       <w:r>
         <w:rPr>
           <w:rFonts w:hint="eastAsia"/>
@@ -801,7 +770,7 @@
           <w:noProof/>
         </w:rPr>
         <w:drawing>
-          <wp:inline distT="0" distB="0" distL="0" distR="0" wp14:anchorId="56F32D4A" wp14:editId="53503024">
+          <wp:inline distT="0" distB="0" distL="0" distR="0" wp14:anchorId="0DD71B55" wp14:editId="10403B29">
             <wp:extent cx="5274310" cy="4395470"/>
             <wp:effectExtent l="0" t="0" r="2540" b="5080"/>
             <wp:docPr id="1" name="图片 1"/>
@@ -840,7 +809,7 @@
     <w:p/>
     <w:p>
       <w:pPr>
-        <w:pStyle w:val="a4"/>
+        <w:pStyle w:val="ListParagraph"/>
         <w:numPr>
           <w:ilvl w:val="0"/>
           <w:numId w:val="2"/>
@@ -865,7 +834,7 @@
     </w:p>
     <w:p>
       <w:pPr>
-        <w:pStyle w:val="a4"/>
+        <w:pStyle w:val="ListParagraph"/>
         <w:numPr>
           <w:ilvl w:val="0"/>
           <w:numId w:val="2"/>
@@ -898,7 +867,7 @@
     </w:p>
     <w:p>
       <w:pPr>
-        <w:pStyle w:val="a4"/>
+        <w:pStyle w:val="ListParagraph"/>
         <w:ind w:left="360" w:firstLineChars="0" w:firstLine="0"/>
       </w:pPr>
       <w:r>
@@ -910,7 +879,7 @@
     </w:p>
     <w:p>
       <w:pPr>
-        <w:pStyle w:val="a4"/>
+        <w:pStyle w:val="ListParagraph"/>
         <w:ind w:left="360" w:firstLineChars="0" w:firstLine="0"/>
       </w:pPr>
       <w:r>
@@ -922,7 +891,7 @@
     </w:p>
     <w:p>
       <w:pPr>
-        <w:pStyle w:val="a4"/>
+        <w:pStyle w:val="ListParagraph"/>
         <w:ind w:left="360" w:firstLineChars="0" w:firstLine="0"/>
       </w:pPr>
       <w:r>
@@ -971,7 +940,7 @@
     </w:p>
     <w:p>
       <w:pPr>
-        <w:pStyle w:val="a4"/>
+        <w:pStyle w:val="ListParagraph"/>
         <w:ind w:left="360" w:firstLineChars="0" w:firstLine="0"/>
       </w:pPr>
       <w:r>
@@ -983,7 +952,7 @@
     </w:p>
     <w:p>
       <w:pPr>
-        <w:pStyle w:val="a4"/>
+        <w:pStyle w:val="ListParagraph"/>
         <w:ind w:left="360" w:firstLineChars="0" w:firstLine="0"/>
       </w:pPr>
       <w:r>
@@ -992,7 +961,7 @@
         </w:rPr>
         <w:lastRenderedPageBreak/>
         <w:drawing>
-          <wp:inline distT="0" distB="0" distL="0" distR="0" wp14:anchorId="646096DE" wp14:editId="23E36BAB">
+          <wp:inline distT="0" distB="0" distL="0" distR="0" wp14:anchorId="0B2A5EFA" wp14:editId="738A5071">
             <wp:extent cx="5274310" cy="5030470"/>
             <wp:effectExtent l="0" t="0" r="2540" b="0"/>
             <wp:docPr id="3" name="图片 3"/>
@@ -1030,13 +999,13 @@
     </w:p>
     <w:p>
       <w:pPr>
-        <w:pStyle w:val="a4"/>
-        <w:ind w:left="360" w:firstLineChars="0" w:firstLine="0"/>
-      </w:pPr>
-    </w:p>
-    <w:p>
-      <w:pPr>
-        <w:pStyle w:val="a4"/>
+        <w:pStyle w:val="ListParagraph"/>
+        <w:ind w:left="360" w:firstLineChars="0" w:firstLine="0"/>
+      </w:pPr>
+    </w:p>
+    <w:p>
+      <w:pPr>
+        <w:pStyle w:val="ListParagraph"/>
         <w:numPr>
           <w:ilvl w:val="0"/>
           <w:numId w:val="2"/>
@@ -1069,13 +1038,13 @@
     </w:p>
     <w:p>
       <w:pPr>
-        <w:pStyle w:val="a4"/>
-        <w:ind w:left="360" w:firstLineChars="0" w:firstLine="0"/>
-      </w:pPr>
-    </w:p>
-    <w:p>
-      <w:pPr>
-        <w:pStyle w:val="a4"/>
+        <w:pStyle w:val="ListParagraph"/>
+        <w:ind w:left="360" w:firstLineChars="0" w:firstLine="0"/>
+      </w:pPr>
+    </w:p>
+    <w:p>
+      <w:pPr>
+        <w:pStyle w:val="ListParagraph"/>
         <w:ind w:left="360" w:firstLineChars="0" w:firstLine="0"/>
       </w:pPr>
       <w:r>
@@ -1087,7 +1056,7 @@
     </w:p>
     <w:p>
       <w:pPr>
-        <w:pStyle w:val="a4"/>
+        <w:pStyle w:val="ListParagraph"/>
         <w:ind w:left="360" w:firstLineChars="0" w:firstLine="0"/>
       </w:pPr>
       <w:r>
@@ -1099,13 +1068,13 @@
     </w:p>
     <w:p>
       <w:pPr>
-        <w:pStyle w:val="a4"/>
-        <w:ind w:left="360" w:firstLineChars="0" w:firstLine="0"/>
-      </w:pPr>
-    </w:p>
-    <w:p>
-      <w:pPr>
-        <w:pStyle w:val="a4"/>
+        <w:pStyle w:val="ListParagraph"/>
+        <w:ind w:left="360" w:firstLineChars="0" w:firstLine="0"/>
+      </w:pPr>
+    </w:p>
+    <w:p>
+      <w:pPr>
+        <w:pStyle w:val="ListParagraph"/>
         <w:ind w:left="360" w:firstLineChars="0" w:firstLine="0"/>
       </w:pPr>
       <w:r>
@@ -1114,7 +1083,7 @@
         </w:rPr>
         <w:lastRenderedPageBreak/>
         <w:drawing>
-          <wp:inline distT="0" distB="0" distL="0" distR="0" wp14:anchorId="14C3DB0F" wp14:editId="38B77AA8">
+          <wp:inline distT="0" distB="0" distL="0" distR="0" wp14:anchorId="1C3D0506" wp14:editId="6BF68853">
             <wp:extent cx="5274310" cy="4472305"/>
             <wp:effectExtent l="0" t="0" r="2540" b="4445"/>
             <wp:docPr id="4" name="图片 4"/>
@@ -1152,13 +1121,13 @@
     </w:p>
     <w:p>
       <w:pPr>
-        <w:pStyle w:val="a4"/>
-        <w:ind w:left="360" w:firstLineChars="0" w:firstLine="0"/>
-      </w:pPr>
-    </w:p>
-    <w:p>
-      <w:pPr>
-        <w:pStyle w:val="a4"/>
+        <w:pStyle w:val="ListParagraph"/>
+        <w:ind w:left="360" w:firstLineChars="0" w:firstLine="0"/>
+      </w:pPr>
+    </w:p>
+    <w:p>
+      <w:pPr>
+        <w:pStyle w:val="ListParagraph"/>
         <w:ind w:left="360" w:firstLineChars="0" w:firstLine="0"/>
         <w:rPr>
           <w:b/>
@@ -1188,7 +1157,7 @@
     </w:p>
     <w:p>
       <w:pPr>
-        <w:pStyle w:val="a4"/>
+        <w:pStyle w:val="ListParagraph"/>
         <w:ind w:left="360" w:firstLineChars="0" w:firstLine="0"/>
       </w:pPr>
       <w:r>
@@ -1306,13 +1275,13 @@
     </w:p>
     <w:p>
       <w:pPr>
-        <w:pStyle w:val="a4"/>
-        <w:ind w:left="360" w:firstLineChars="0" w:firstLine="0"/>
-      </w:pPr>
-    </w:p>
-    <w:p>
-      <w:pPr>
-        <w:pStyle w:val="a4"/>
+        <w:pStyle w:val="ListParagraph"/>
+        <w:ind w:left="360" w:firstLineChars="0" w:firstLine="0"/>
+      </w:pPr>
+    </w:p>
+    <w:p>
+      <w:pPr>
+        <w:pStyle w:val="ListParagraph"/>
         <w:ind w:left="360" w:firstLineChars="0" w:firstLine="0"/>
         <w:rPr>
           <w:b/>
@@ -1336,7 +1305,7 @@
     </w:p>
     <w:p>
       <w:pPr>
-        <w:pStyle w:val="a4"/>
+        <w:pStyle w:val="ListParagraph"/>
         <w:ind w:left="360" w:firstLineChars="0" w:firstLine="0"/>
       </w:pPr>
       <w:r>
@@ -1379,7 +1348,7 @@
     </w:p>
     <w:p>
       <w:pPr>
-        <w:pStyle w:val="a4"/>
+        <w:pStyle w:val="ListParagraph"/>
         <w:ind w:left="360" w:firstLineChars="0" w:firstLine="0"/>
       </w:pPr>
       <w:r>
@@ -1417,13 +1386,13 @@
     </w:p>
     <w:p>
       <w:pPr>
-        <w:pStyle w:val="a4"/>
-        <w:ind w:left="360" w:firstLineChars="0" w:firstLine="0"/>
-      </w:pPr>
-    </w:p>
-    <w:p>
-      <w:pPr>
-        <w:pStyle w:val="a4"/>
+        <w:pStyle w:val="ListParagraph"/>
+        <w:ind w:left="360" w:firstLineChars="0" w:firstLine="0"/>
+      </w:pPr>
+    </w:p>
+    <w:p>
+      <w:pPr>
+        <w:pStyle w:val="ListParagraph"/>
         <w:ind w:left="360" w:firstLineChars="0" w:firstLine="0"/>
         <w:rPr>
           <w:b/>
@@ -1460,7 +1429,7 @@
     </w:p>
     <w:p>
       <w:pPr>
-        <w:pStyle w:val="a4"/>
+        <w:pStyle w:val="ListParagraph"/>
         <w:ind w:left="360" w:firstLineChars="0" w:firstLine="0"/>
       </w:pPr>
       <w:r>
@@ -1489,13 +1458,13 @@
     </w:p>
     <w:p>
       <w:pPr>
-        <w:pStyle w:val="a4"/>
-        <w:ind w:left="360" w:firstLineChars="0" w:firstLine="0"/>
-      </w:pPr>
-    </w:p>
-    <w:p>
-      <w:pPr>
-        <w:pStyle w:val="a4"/>
+        <w:pStyle w:val="ListParagraph"/>
+        <w:ind w:left="360" w:firstLineChars="0" w:firstLine="0"/>
+      </w:pPr>
+    </w:p>
+    <w:p>
+      <w:pPr>
+        <w:pStyle w:val="ListParagraph"/>
         <w:ind w:left="360" w:firstLineChars="0" w:firstLine="0"/>
         <w:rPr>
           <w:b/>
@@ -1530,7 +1499,7 @@
     </w:p>
     <w:p>
       <w:pPr>
-        <w:pStyle w:val="a4"/>
+        <w:pStyle w:val="ListParagraph"/>
         <w:ind w:left="360" w:firstLineChars="0" w:firstLine="0"/>
         <w:rPr>
           <w:b/>
@@ -1565,7 +1534,7 @@
     </w:p>
     <w:p>
       <w:pPr>
-        <w:pStyle w:val="a4"/>
+        <w:pStyle w:val="ListParagraph"/>
         <w:ind w:left="360" w:firstLineChars="0" w:firstLine="0"/>
         <w:rPr>
           <w:b/>
@@ -1574,7 +1543,7 @@
     </w:p>
     <w:p>
       <w:pPr>
-        <w:pStyle w:val="a4"/>
+        <w:pStyle w:val="ListParagraph"/>
         <w:ind w:left="360" w:firstLineChars="0" w:firstLine="0"/>
       </w:pPr>
       <w:r>
@@ -1620,7 +1589,7 @@
     </w:p>
     <w:p>
       <w:pPr>
-        <w:pStyle w:val="a4"/>
+        <w:pStyle w:val="ListParagraph"/>
         <w:ind w:left="360" w:firstLineChars="0" w:firstLine="0"/>
       </w:pPr>
       <w:proofErr w:type="spellStart"/>
@@ -1635,21 +1604,7 @@
         <w:rPr>
           <w:rFonts w:hint="eastAsia"/>
         </w:rPr>
-        <w:t>的</w:t>
-      </w:r>
-      <w:proofErr w:type="gramStart"/>
-      <w:r>
-        <w:rPr>
-          <w:rFonts w:hint="eastAsia"/>
-        </w:rPr>
-        <w:t>值需要</w:t>
-      </w:r>
-      <w:proofErr w:type="gramEnd"/>
-      <w:r>
-        <w:rPr>
-          <w:rFonts w:hint="eastAsia"/>
-        </w:rPr>
-        <w:t>以node开头，但不能只是node。新增的</w:t>
+        <w:t>的值需要以node开头，但不能只是node。新增的</w:t>
       </w:r>
       <w:proofErr w:type="spellStart"/>
       <w:r>
@@ -1724,7 +1679,7 @@
     </w:p>
     <w:p>
       <w:pPr>
-        <w:pStyle w:val="a4"/>
+        <w:pStyle w:val="ListParagraph"/>
         <w:ind w:left="360" w:firstLineChars="0" w:firstLine="0"/>
         <w:rPr>
           <w:b/>
@@ -1733,7 +1688,7 @@
     </w:p>
     <w:p>
       <w:pPr>
-        <w:pStyle w:val="a4"/>
+        <w:pStyle w:val="ListParagraph"/>
         <w:ind w:left="360" w:firstLineChars="0" w:firstLine="0"/>
         <w:rPr>
           <w:b/>
@@ -1744,7 +1699,7 @@
           <w:noProof/>
         </w:rPr>
         <w:drawing>
-          <wp:inline distT="0" distB="0" distL="0" distR="0" wp14:anchorId="6FE324A3" wp14:editId="7FB9B62E">
+          <wp:inline distT="0" distB="0" distL="0" distR="0" wp14:anchorId="6BD8CD7D" wp14:editId="77501FA1">
             <wp:extent cx="5274310" cy="1306195"/>
             <wp:effectExtent l="0" t="0" r="2540" b="8255"/>
             <wp:docPr id="6" name="图片 6"/>
@@ -1782,7 +1737,7 @@
     </w:p>
     <w:p>
       <w:pPr>
-        <w:pStyle w:val="a4"/>
+        <w:pStyle w:val="ListParagraph"/>
         <w:ind w:left="360" w:firstLineChars="0" w:firstLine="0"/>
         <w:rPr>
           <w:b/>
@@ -1791,7 +1746,7 @@
     </w:p>
     <w:p>
       <w:pPr>
-        <w:pStyle w:val="a4"/>
+        <w:pStyle w:val="ListParagraph"/>
         <w:ind w:left="360" w:firstLineChars="0" w:firstLine="0"/>
         <w:rPr>
           <w:b/>
@@ -1832,7 +1787,7 @@
     </w:p>
     <w:p>
       <w:pPr>
-        <w:pStyle w:val="a4"/>
+        <w:pStyle w:val="ListParagraph"/>
         <w:ind w:left="360" w:firstLineChars="0" w:firstLine="0"/>
       </w:pPr>
       <w:r>
@@ -1844,13 +1799,13 @@
     </w:p>
     <w:p>
       <w:pPr>
-        <w:pStyle w:val="a4"/>
-        <w:ind w:left="360" w:firstLineChars="0" w:firstLine="0"/>
-      </w:pPr>
-    </w:p>
-    <w:p>
-      <w:pPr>
-        <w:pStyle w:val="a4"/>
+        <w:pStyle w:val="ListParagraph"/>
+        <w:ind w:left="360" w:firstLineChars="0" w:firstLine="0"/>
+      </w:pPr>
+    </w:p>
+    <w:p>
+      <w:pPr>
+        <w:pStyle w:val="ListParagraph"/>
         <w:ind w:left="360" w:firstLineChars="0" w:firstLine="0"/>
       </w:pPr>
       <w:r>
@@ -1862,7 +1817,7 @@
     </w:p>
     <w:p>
       <w:pPr>
-        <w:pStyle w:val="a4"/>
+        <w:pStyle w:val="ListParagraph"/>
         <w:ind w:left="360" w:firstLineChars="0" w:firstLine="0"/>
         <w:rPr>
           <w:b/>
@@ -1871,7 +1826,7 @@
     </w:p>
     <w:p>
       <w:pPr>
-        <w:pStyle w:val="a4"/>
+        <w:pStyle w:val="ListParagraph"/>
         <w:numPr>
           <w:ilvl w:val="0"/>
           <w:numId w:val="2"/>
@@ -1891,7 +1846,7 @@
     </w:p>
     <w:p>
       <w:pPr>
-        <w:pStyle w:val="a4"/>
+        <w:pStyle w:val="ListParagraph"/>
         <w:ind w:left="360" w:firstLineChars="0" w:firstLine="0"/>
         <w:rPr>
           <w:b/>
@@ -1902,7 +1857,7 @@
           <w:noProof/>
         </w:rPr>
         <w:drawing>
-          <wp:inline distT="0" distB="0" distL="0" distR="0" wp14:anchorId="12F930DE" wp14:editId="6A5751D4">
+          <wp:inline distT="0" distB="0" distL="0" distR="0" wp14:anchorId="57DA60FE" wp14:editId="6FC7D3B3">
             <wp:extent cx="5274310" cy="1299210"/>
             <wp:effectExtent l="0" t="0" r="2540" b="0"/>
             <wp:docPr id="7" name="图片 7"/>
@@ -1940,13 +1895,13 @@
     </w:p>
     <w:p>
       <w:pPr>
-        <w:pStyle w:val="a4"/>
-        <w:ind w:left="360" w:firstLineChars="0" w:firstLine="0"/>
-      </w:pPr>
-    </w:p>
-    <w:p>
-      <w:pPr>
-        <w:pStyle w:val="a4"/>
+        <w:pStyle w:val="ListParagraph"/>
+        <w:ind w:left="360" w:firstLineChars="0" w:firstLine="0"/>
+      </w:pPr>
+    </w:p>
+    <w:p>
+      <w:pPr>
+        <w:pStyle w:val="ListParagraph"/>
         <w:ind w:left="360" w:firstLineChars="0" w:firstLine="0"/>
       </w:pPr>
       <w:r>
@@ -2027,27 +1982,191 @@
     </w:p>
     <w:p>
       <w:pPr>
-        <w:pStyle w:val="a4"/>
-        <w:ind w:left="360" w:firstLineChars="0" w:firstLine="0"/>
-        <w:rPr>
-          <w:b/>
-        </w:rPr>
-      </w:pPr>
-    </w:p>
-    <w:p>
-      <w:pPr>
-        <w:pStyle w:val="1"/>
-      </w:pPr>
-      <w:r>
-        <w:rPr>
-          <w:rFonts w:hint="eastAsia"/>
-        </w:rPr>
+        <w:pStyle w:val="ListParagraph"/>
+        <w:ind w:left="360" w:firstLineChars="0" w:firstLine="0"/>
+      </w:pPr>
+    </w:p>
+    <w:p>
+      <w:pPr>
+        <w:pStyle w:val="Heading1"/>
+      </w:pPr>
+      <w:r>
+        <w:rPr>
+          <w:rFonts w:hint="eastAsia"/>
+        </w:rPr>
+        <w:t>在初始化之前</w:t>
+      </w:r>
+    </w:p>
+    <w:p>
+      <w:r>
+        <w:rPr>
+          <w:rFonts w:hint="eastAsia"/>
+        </w:rPr>
+        <w:t>此时，所有的</w:t>
+      </w:r>
+      <w:proofErr w:type="spellStart"/>
+      <w:r>
+        <w:rPr>
+          <w:rFonts w:hint="eastAsia"/>
+        </w:rPr>
+        <w:t>NodeAgent</w:t>
+      </w:r>
+      <w:proofErr w:type="spellEnd"/>
+      <w:r>
+        <w:rPr>
+          <w:rFonts w:hint="eastAsia"/>
+        </w:rPr>
+        <w:t>已经启动成功了。如果网络配置是在多台机器上运行的</w:t>
+      </w:r>
+      <w:proofErr w:type="spellStart"/>
+      <w:r>
+        <w:rPr>
+          <w:rFonts w:hint="eastAsia"/>
+        </w:rPr>
+        <w:t>NodeAgent</w:t>
+      </w:r>
+      <w:proofErr w:type="spellEnd"/>
+      <w:r>
+        <w:rPr>
+          <w:rFonts w:hint="eastAsia"/>
+        </w:rPr>
+        <w:t>，那么需要在这些机器上配置一下系统防火墙，需要允许以下端口可以被其他node连接接：</w:t>
+      </w:r>
+    </w:p>
+    <w:p>
+      <w:r>
+        <w:rPr>
+          <w:rFonts w:hint="eastAsia"/>
+        </w:rPr>
+        <w:t>P2P Port</w:t>
+      </w:r>
+      <w:r>
+        <w:tab/>
+      </w:r>
+      <w:r>
+        <w:tab/>
+      </w:r>
+      <w:r>
+        <w:tab/>
+      </w:r>
+      <w:r>
+        <w:tab/>
+      </w:r>
+      <w:r>
+        <w:rPr>
+          <w:rFonts w:hint="eastAsia"/>
+        </w:rPr>
+        <w:t>26656</w:t>
+      </w:r>
+    </w:p>
+    <w:p>
+      <w:pPr>
+        <w:rPr>
+          <w:rFonts w:hint="eastAsia"/>
+        </w:rPr>
+      </w:pPr>
+      <w:r>
+        <w:tab/>
+        <w:t>N</w:t>
+      </w:r>
+      <w:r>
+        <w:rPr>
+          <w:rFonts w:hint="eastAsia"/>
+        </w:rPr>
+        <w:t>ode之间会通过P2P Port进行数据同步</w:t>
+      </w:r>
+    </w:p>
+    <w:p>
+      <w:proofErr w:type="spellStart"/>
+      <w:r>
+        <w:rPr>
+          <w:rFonts w:hint="eastAsia"/>
+        </w:rPr>
+        <w:t>WebService</w:t>
+      </w:r>
+      <w:proofErr w:type="spellEnd"/>
+      <w:r>
+        <w:rPr>
+          <w:rFonts w:hint="eastAsia"/>
+        </w:rPr>
+        <w:t xml:space="preserve"> Port</w:t>
+      </w:r>
+      <w:r>
+        <w:tab/>
+      </w:r>
+      <w:r>
+        <w:tab/>
+      </w:r>
+      <w:r>
+        <w:rPr>
+          <w:rFonts w:hint="eastAsia"/>
+        </w:rPr>
+        <w:t>1001</w:t>
+      </w:r>
+    </w:p>
+    <w:p>
+      <w:pPr>
+        <w:rPr>
+          <w:rFonts w:hint="eastAsia"/>
+        </w:rPr>
+      </w:pPr>
+      <w:r>
+        <w:tab/>
+      </w:r>
+      <w:proofErr w:type="spellStart"/>
+      <w:r>
+        <w:rPr>
+          <w:rFonts w:hint="eastAsia"/>
+        </w:rPr>
+        <w:t>WebService</w:t>
+      </w:r>
+      <w:proofErr w:type="spellEnd"/>
+      <w:r>
+        <w:rPr>
+          <w:rFonts w:hint="eastAsia"/>
+        </w:rPr>
+        <w:t xml:space="preserve"> Port用于处理数据存取的功能</w:t>
+      </w:r>
+    </w:p>
+    <w:p>
+      <w:pPr>
+        <w:rPr>
+          <w:rFonts w:hint="eastAsia"/>
+        </w:rPr>
+      </w:pPr>
+      <w:r>
+        <w:rPr>
+          <w:rFonts w:hint="eastAsia"/>
+        </w:rPr>
+        <w:t>以上是默认端口，如果在执行</w:t>
+      </w:r>
+      <w:proofErr w:type="spellStart"/>
+      <w:r>
+        <w:t>InitializeChainNode</w:t>
+      </w:r>
+      <w:proofErr w:type="spellEnd"/>
+      <w:r>
+        <w:rPr>
+          <w:rFonts w:hint="eastAsia"/>
+        </w:rPr>
+        <w:t>时传入的参数中修改了默认端口，那么也请更新防火墙的规则。</w:t>
+      </w:r>
+    </w:p>
+    <w:p>
+      <w:pPr>
+        <w:pStyle w:val="Heading1"/>
+      </w:pPr>
+      <w:r>
+        <w:rPr>
+          <w:rFonts w:hint="eastAsia"/>
+        </w:rPr>
+        <w:lastRenderedPageBreak/>
         <w:t>初始化节点</w:t>
       </w:r>
     </w:p>
     <w:p>
       <w:pPr>
-        <w:pStyle w:val="a4"/>
+        <w:pStyle w:val="ListParagraph"/>
         <w:ind w:left="360" w:firstLineChars="0" w:firstLine="0"/>
       </w:pPr>
       <w:r>
@@ -2094,7 +2213,7 @@
     </w:p>
     <w:p>
       <w:pPr>
-        <w:pStyle w:val="a4"/>
+        <w:pStyle w:val="ListParagraph"/>
         <w:ind w:left="360" w:firstLineChars="0" w:firstLine="0"/>
       </w:pPr>
       <w:r>
@@ -2115,7 +2234,7 @@
     </w:p>
     <w:p>
       <w:pPr>
-        <w:pStyle w:val="a4"/>
+        <w:pStyle w:val="ListParagraph"/>
         <w:ind w:left="360" w:firstLineChars="0" w:firstLine="0"/>
       </w:pPr>
       <w:r>
@@ -2136,13 +2255,13 @@
     </w:p>
     <w:p>
       <w:pPr>
-        <w:pStyle w:val="a4"/>
-        <w:ind w:left="360" w:firstLineChars="0" w:firstLine="0"/>
-      </w:pPr>
-    </w:p>
-    <w:p>
-      <w:pPr>
-        <w:pStyle w:val="a4"/>
+        <w:pStyle w:val="ListParagraph"/>
+        <w:ind w:left="360" w:firstLineChars="0" w:firstLine="0"/>
+      </w:pPr>
+    </w:p>
+    <w:p>
+      <w:pPr>
+        <w:pStyle w:val="ListParagraph"/>
         <w:ind w:left="360" w:firstLineChars="0" w:firstLine="0"/>
       </w:pPr>
       <w:r>
@@ -2195,26 +2314,25 @@
     </w:p>
     <w:p>
       <w:pPr>
-        <w:pStyle w:val="a4"/>
-        <w:ind w:left="360" w:firstLineChars="0" w:firstLine="0"/>
-      </w:pPr>
-    </w:p>
-    <w:p>
-      <w:pPr>
-        <w:pStyle w:val="a4"/>
-        <w:ind w:left="360" w:firstLineChars="0" w:firstLine="0"/>
-      </w:pPr>
-      <w:r>
-        <w:rPr>
-          <w:rFonts w:hint="eastAsia"/>
-        </w:rPr>
-        <w:lastRenderedPageBreak/>
+        <w:pStyle w:val="ListParagraph"/>
+        <w:ind w:left="360" w:firstLineChars="0" w:firstLine="0"/>
+      </w:pPr>
+    </w:p>
+    <w:p>
+      <w:pPr>
+        <w:pStyle w:val="ListParagraph"/>
+        <w:ind w:left="360" w:firstLineChars="0" w:firstLine="0"/>
+      </w:pPr>
+      <w:r>
+        <w:rPr>
+          <w:rFonts w:hint="eastAsia"/>
+        </w:rPr>
         <w:t>初始化完成，并且节点启动成功以后，进程结构如图所示:</w:t>
       </w:r>
     </w:p>
     <w:p>
       <w:pPr>
-        <w:pStyle w:val="a4"/>
+        <w:pStyle w:val="ListParagraph"/>
         <w:ind w:left="360" w:firstLineChars="0" w:firstLine="0"/>
       </w:pPr>
       <w:r>
@@ -2222,7 +2340,7 @@
           <w:noProof/>
         </w:rPr>
         <w:drawing>
-          <wp:inline distT="0" distB="0" distL="0" distR="0" wp14:anchorId="20809524" wp14:editId="1D961FB1">
+          <wp:inline distT="0" distB="0" distL="0" distR="0" wp14:anchorId="60117BA7" wp14:editId="19C198CD">
             <wp:extent cx="5274310" cy="2069465"/>
             <wp:effectExtent l="0" t="0" r="2540" b="6985"/>
             <wp:docPr id="9" name="图片 9"/>
@@ -2260,7 +2378,7 @@
     </w:p>
     <w:p>
       <w:pPr>
-        <w:pStyle w:val="1"/>
+        <w:pStyle w:val="Heading1"/>
       </w:pPr>
       <w:r>
         <w:rPr>
@@ -2271,7 +2389,7 @@
     </w:p>
     <w:p>
       <w:pPr>
-        <w:pStyle w:val="a4"/>
+        <w:pStyle w:val="ListParagraph"/>
         <w:ind w:left="360" w:firstLineChars="0" w:firstLine="0"/>
         <w:rPr>
           <w:b/>
@@ -2287,7 +2405,7 @@
     </w:p>
     <w:tbl>
       <w:tblPr>
-        <w:tblStyle w:val="a3"/>
+        <w:tblStyle w:val="TableGrid"/>
         <w:tblW w:w="0" w:type="auto"/>
         <w:tblInd w:w="360" w:type="dxa"/>
         <w:tblLook w:val="04A0" w:firstRow="1" w:lastRow="0" w:firstColumn="1" w:lastColumn="0" w:noHBand="0" w:noVBand="1"/>
@@ -2303,7 +2421,7 @@
           </w:tcPr>
           <w:p>
             <w:pPr>
-              <w:pStyle w:val="a4"/>
+              <w:pStyle w:val="ListParagraph"/>
               <w:ind w:firstLineChars="0" w:firstLine="0"/>
               <w:rPr>
                 <w:b/>
@@ -2324,7 +2442,7 @@
           </w:tcPr>
           <w:p>
             <w:pPr>
-              <w:pStyle w:val="a4"/>
+              <w:pStyle w:val="ListParagraph"/>
               <w:ind w:firstLineChars="0" w:firstLine="0"/>
               <w:rPr>
                 <w:b/>
@@ -2347,7 +2465,7 @@
           </w:tcPr>
           <w:p>
             <w:pPr>
-              <w:pStyle w:val="a4"/>
+              <w:pStyle w:val="ListParagraph"/>
               <w:ind w:firstLineChars="0" w:firstLine="0"/>
               <w:rPr>
                 <w:b/>
@@ -2374,7 +2492,7 @@
           </w:tcPr>
           <w:p>
             <w:pPr>
-              <w:pStyle w:val="a4"/>
+              <w:pStyle w:val="ListParagraph"/>
               <w:ind w:firstLineChars="0" w:firstLine="0"/>
               <w:rPr>
                 <w:b/>
@@ -2431,7 +2549,7 @@
           </w:tcPr>
           <w:p>
             <w:pPr>
-              <w:pStyle w:val="a4"/>
+              <w:pStyle w:val="ListParagraph"/>
               <w:ind w:firstLineChars="0" w:firstLine="0"/>
               <w:rPr>
                 <w:b/>
@@ -2453,7 +2571,7 @@
           </w:tcPr>
           <w:p>
             <w:pPr>
-              <w:pStyle w:val="a4"/>
+              <w:pStyle w:val="ListParagraph"/>
               <w:ind w:firstLineChars="0" w:firstLine="0"/>
               <w:rPr>
                 <w:b/>
@@ -2472,7 +2590,7 @@
     </w:tbl>
     <w:p>
       <w:pPr>
-        <w:pStyle w:val="a4"/>
+        <w:pStyle w:val="ListParagraph"/>
         <w:ind w:left="360" w:firstLineChars="0" w:firstLine="0"/>
         <w:rPr>
           <w:b/>
@@ -2488,7 +2606,7 @@
     </w:p>
     <w:p>
       <w:pPr>
-        <w:pStyle w:val="a4"/>
+        <w:pStyle w:val="ListParagraph"/>
         <w:ind w:left="360" w:firstLineChars="0" w:firstLine="0"/>
         <w:rPr>
           <w:b/>
@@ -2504,7 +2622,7 @@
     </w:p>
     <w:p>
       <w:pPr>
-        <w:pStyle w:val="a4"/>
+        <w:pStyle w:val="ListParagraph"/>
         <w:ind w:left="360" w:firstLineChars="0" w:firstLine="0"/>
       </w:pPr>
       <w:r>
@@ -2519,7 +2637,7 @@
     </w:p>
     <w:p>
       <w:pPr>
-        <w:pStyle w:val="a4"/>
+        <w:pStyle w:val="ListParagraph"/>
         <w:ind w:left="360" w:firstLineChars="0" w:firstLine="0"/>
       </w:pPr>
       <w:r>
@@ -2528,7 +2646,7 @@
     </w:p>
     <w:p>
       <w:pPr>
-        <w:pStyle w:val="a4"/>
+        <w:pStyle w:val="ListParagraph"/>
         <w:ind w:left="360"/>
       </w:pPr>
       <w:r>
@@ -2537,7 +2655,7 @@
     </w:p>
     <w:p>
       <w:pPr>
-        <w:pStyle w:val="a4"/>
+        <w:pStyle w:val="ListParagraph"/>
         <w:ind w:left="360"/>
       </w:pPr>
       <w:r>
@@ -2552,7 +2670,7 @@
     </w:p>
     <w:p>
       <w:pPr>
-        <w:pStyle w:val="a4"/>
+        <w:pStyle w:val="ListParagraph"/>
         <w:ind w:left="360" w:firstLineChars="0" w:firstLine="0"/>
       </w:pPr>
       <w:r>
@@ -2562,26 +2680,18 @@
         <w:t>👉</w:t>
       </w:r>
       <w:r>
-        <w:t xml:space="preserve"> Query http://localhost:3166/api/appservers to fetch </w:t>
-      </w:r>
-      <w:proofErr w:type="spellStart"/>
-      <w:r>
-        <w:t>webservice</w:t>
-      </w:r>
-      <w:proofErr w:type="spellEnd"/>
-      <w:r>
-        <w:t xml:space="preserve"> addresses of node app</w:t>
-      </w:r>
-    </w:p>
-    <w:p>
-      <w:pPr>
-        <w:pStyle w:val="a4"/>
-        <w:ind w:left="360" w:firstLineChars="0" w:firstLine="0"/>
-      </w:pPr>
-    </w:p>
-    <w:p>
-      <w:pPr>
-        <w:pStyle w:val="a4"/>
+        <w:t xml:space="preserve"> Query http://localhost:3166/api/appservers to fetch webservice addresses of node app</w:t>
+      </w:r>
+    </w:p>
+    <w:p>
+      <w:pPr>
+        <w:pStyle w:val="ListParagraph"/>
+        <w:ind w:left="360" w:firstLineChars="0" w:firstLine="0"/>
+      </w:pPr>
+    </w:p>
+    <w:p>
+      <w:pPr>
+        <w:pStyle w:val="ListParagraph"/>
         <w:ind w:left="360" w:firstLineChars="0" w:firstLine="0"/>
       </w:pPr>
       <w:r>
@@ -2602,21 +2712,21 @@
       <w:hyperlink r:id="rId11" w:history="1">
         <w:r>
           <w:rPr>
-            <w:rStyle w:val="a5"/>
+            <w:rStyle w:val="Hyperlink"/>
           </w:rPr>
           <w:t>http://localhost:3166/api/appservers</w:t>
         </w:r>
       </w:hyperlink>
       <w:r>
         <w:rPr>
-          <w:rStyle w:val="a5"/>
+          <w:rStyle w:val="Hyperlink"/>
         </w:rPr>
         <w:t xml:space="preserve">  </w:t>
       </w:r>
     </w:p>
     <w:p>
       <w:pPr>
-        <w:pStyle w:val="a4"/>
+        <w:pStyle w:val="ListParagraph"/>
         <w:ind w:left="360" w:firstLineChars="0" w:firstLine="0"/>
       </w:pPr>
       <w:r>
@@ -2628,15 +2738,16 @@
     </w:p>
     <w:p>
       <w:pPr>
-        <w:pStyle w:val="a4"/>
+        <w:pStyle w:val="ListParagraph"/>
         <w:ind w:left="360" w:firstLineChars="0" w:firstLine="0"/>
       </w:pPr>
       <w:r>
         <w:rPr>
           <w:noProof/>
         </w:rPr>
+        <w:lastRenderedPageBreak/>
         <w:drawing>
-          <wp:inline distT="0" distB="0" distL="0" distR="0" wp14:anchorId="08973674" wp14:editId="69DE937B">
+          <wp:inline distT="0" distB="0" distL="0" distR="0" wp14:anchorId="330FAFDD" wp14:editId="7BDA7E62">
             <wp:extent cx="3375953" cy="2530059"/>
             <wp:effectExtent l="0" t="0" r="0" b="3810"/>
             <wp:docPr id="5" name="图片 5"/>
@@ -2674,13 +2785,29 @@
     </w:p>
     <w:p>
       <w:pPr>
-        <w:pStyle w:val="a4"/>
-        <w:ind w:left="360" w:firstLineChars="0" w:firstLine="0"/>
-      </w:pPr>
-    </w:p>
-    <w:p>
-      <w:pPr>
-        <w:pStyle w:val="a4"/>
+        <w:pStyle w:val="ListParagraph"/>
+        <w:ind w:left="360" w:firstLineChars="0" w:firstLine="0"/>
+        <w:rPr>
+          <w:rFonts w:hint="eastAsia"/>
+        </w:rPr>
+      </w:pPr>
+      <w:r>
+        <w:rPr>
+          <w:rFonts w:hint="eastAsia"/>
+          <w:highlight w:val="yellow"/>
+        </w:rPr>
+        <w:t>新的版本中已经加入了token功能，用于server鉴别client身份。</w:t>
+      </w:r>
+    </w:p>
+    <w:p>
+      <w:pPr>
+        <w:pStyle w:val="ListParagraph"/>
+        <w:ind w:left="360" w:firstLineChars="0" w:firstLine="0"/>
+      </w:pPr>
+    </w:p>
+    <w:p>
+      <w:pPr>
+        <w:pStyle w:val="ListParagraph"/>
         <w:ind w:left="360" w:firstLineChars="0" w:firstLine="0"/>
       </w:pPr>
       <w:r>
@@ -2708,11 +2835,8 @@
     </w:p>
     <w:p>
       <w:pPr>
-        <w:pStyle w:val="a4"/>
-        <w:ind w:left="360" w:firstLineChars="0" w:firstLine="0"/>
-        <w:rPr>
-          <w:rFonts w:hint="eastAsia"/>
-        </w:rPr>
+        <w:pStyle w:val="ListParagraph"/>
+        <w:ind w:left="360" w:firstLineChars="0" w:firstLine="0"/>
       </w:pPr>
       <w:r>
         <w:rPr>
@@ -2737,12 +2861,10 @@
         </w:rPr>
         <w:t>package，</w:t>
       </w:r>
-      <w:bookmarkStart w:id="0" w:name="_GoBack"/>
-      <w:bookmarkEnd w:id="0"/>
-    </w:p>
-    <w:p>
-      <w:pPr>
-        <w:pStyle w:val="a4"/>
+    </w:p>
+    <w:p>
+      <w:pPr>
+        <w:pStyle w:val="ListParagraph"/>
         <w:ind w:left="360" w:firstLineChars="0" w:firstLine="0"/>
       </w:pPr>
       <w:proofErr w:type="spellStart"/>
@@ -2757,7 +2879,7 @@
     <w:p/>
     <w:p>
       <w:pPr>
-        <w:pStyle w:val="a4"/>
+        <w:pStyle w:val="ListParagraph"/>
         <w:ind w:left="360" w:firstLineChars="0" w:firstLine="0"/>
       </w:pPr>
       <w:r>
@@ -2775,7 +2897,7 @@
     </w:p>
     <w:p>
       <w:pPr>
-        <w:pStyle w:val="a4"/>
+        <w:pStyle w:val="ListParagraph"/>
         <w:ind w:left="360" w:firstLineChars="0" w:firstLine="0"/>
       </w:pPr>
       <w:r>
@@ -2783,7 +2905,7 @@
           <w:noProof/>
         </w:rPr>
         <w:drawing>
-          <wp:inline distT="0" distB="0" distL="0" distR="0" wp14:anchorId="4E88CEAB" wp14:editId="282C57C2">
+          <wp:inline distT="0" distB="0" distL="0" distR="0" wp14:anchorId="082F7249" wp14:editId="1F401797">
             <wp:extent cx="5274310" cy="3327400"/>
             <wp:effectExtent l="0" t="0" r="2540" b="6350"/>
             <wp:docPr id="8" name="图片 8"/>
@@ -2821,13 +2943,13 @@
     </w:p>
     <w:p>
       <w:pPr>
-        <w:pStyle w:val="a4"/>
-        <w:ind w:left="360" w:firstLineChars="0" w:firstLine="0"/>
-      </w:pPr>
-    </w:p>
-    <w:p>
-      <w:pPr>
-        <w:pStyle w:val="1"/>
+        <w:pStyle w:val="ListParagraph"/>
+        <w:ind w:left="360" w:firstLineChars="0" w:firstLine="0"/>
+      </w:pPr>
+    </w:p>
+    <w:p>
+      <w:pPr>
+        <w:pStyle w:val="Heading1"/>
       </w:pPr>
       <w:r>
         <w:rPr>
@@ -2849,7 +2971,7 @@
     </w:p>
     <w:p>
       <w:pPr>
-        <w:pStyle w:val="a4"/>
+        <w:pStyle w:val="ListParagraph"/>
         <w:numPr>
           <w:ilvl w:val="0"/>
           <w:numId w:val="4"/>
@@ -2860,6 +2982,7 @@
         <w:rPr>
           <w:rFonts w:hint="eastAsia"/>
         </w:rPr>
+        <w:lastRenderedPageBreak/>
         <w:t>添加节点的时候，提示错误:</w:t>
       </w:r>
       <w:r>
@@ -2877,7 +3000,7 @@
     </w:p>
     <w:p>
       <w:pPr>
-        <w:pStyle w:val="a4"/>
+        <w:pStyle w:val="ListParagraph"/>
         <w:ind w:left="360" w:firstLineChars="0" w:firstLine="0"/>
       </w:pPr>
       <w:r>
@@ -2915,7 +3038,7 @@
     </w:p>
     <w:p>
       <w:pPr>
-        <w:pStyle w:val="a4"/>
+        <w:pStyle w:val="ListParagraph"/>
         <w:ind w:left="360" w:firstLineChars="0" w:firstLine="0"/>
       </w:pPr>
       <w:r>
@@ -2941,13 +3064,13 @@
     </w:p>
     <w:p>
       <w:pPr>
-        <w:pStyle w:val="a4"/>
-        <w:ind w:left="360" w:firstLineChars="0" w:firstLine="0"/>
-      </w:pPr>
-    </w:p>
-    <w:p>
-      <w:pPr>
-        <w:pStyle w:val="a4"/>
+        <w:pStyle w:val="ListParagraph"/>
+        <w:ind w:left="360" w:firstLineChars="0" w:firstLine="0"/>
+      </w:pPr>
+    </w:p>
+    <w:p>
+      <w:pPr>
+        <w:pStyle w:val="ListParagraph"/>
         <w:numPr>
           <w:ilvl w:val="0"/>
           <w:numId w:val="4"/>
@@ -2963,7 +3086,7 @@
     </w:p>
     <w:p>
       <w:pPr>
-        <w:pStyle w:val="a4"/>
+        <w:pStyle w:val="ListParagraph"/>
         <w:numPr>
           <w:ilvl w:val="0"/>
           <w:numId w:val="4"/>
@@ -2979,7 +3102,7 @@
     </w:p>
     <w:p>
       <w:pPr>
-        <w:pStyle w:val="a4"/>
+        <w:pStyle w:val="ListParagraph"/>
         <w:numPr>
           <w:ilvl w:val="0"/>
           <w:numId w:val="4"/>
@@ -3013,7 +3136,7 @@
 </file>
 
 <file path=word/numbering.xml><?xml version="1.0" encoding="utf-8"?>
-<w:numbering xmlns:wpc="http://schemas.microsoft.com/office/word/2010/wordprocessingCanvas" xmlns:cx="http://schemas.microsoft.com/office/drawing/2014/chartex" xmlns:mc="http://schemas.openxmlformats.org/markup-compatibility/2006" xmlns:o="urn:schemas-microsoft-com:office:office" xmlns:r="http://schemas.openxmlformats.org/officeDocument/2006/relationships" xmlns:m="http://schemas.openxmlformats.org/officeDocument/2006/math" xmlns:v="urn:schemas-microsoft-com:vml" xmlns:wp14="http://schemas.microsoft.com/office/word/2010/wordprocessingDrawing" xmlns:wp="http://schemas.openxmlformats.org/drawingml/2006/wordprocessingDrawing" xmlns:w10="urn:schemas-microsoft-com:office:word" xmlns:w="http://schemas.openxmlformats.org/wordprocessingml/2006/main" xmlns:w14="http://schemas.microsoft.com/office/word/2010/wordml" xmlns:w15="http://schemas.microsoft.com/office/word/2012/wordml" xmlns:w16se="http://schemas.microsoft.com/office/word/2015/wordml/symex" xmlns:wpg="http://schemas.microsoft.com/office/word/2010/wordprocessingGroup" xmlns:wpi="http://schemas.microsoft.com/office/word/2010/wordprocessingInk" xmlns:wne="http://schemas.microsoft.com/office/word/2006/wordml" xmlns:wps="http://schemas.microsoft.com/office/word/2010/wordprocessingShape" mc:Ignorable="w14 w15 w16se wp14">
+<w:numbering xmlns:wpc="http://schemas.microsoft.com/office/word/2010/wordprocessingCanvas" xmlns:cx="http://schemas.microsoft.com/office/drawing/2014/chartex" xmlns:cx1="http://schemas.microsoft.com/office/drawing/2015/9/8/chartex" xmlns:cx2="http://schemas.microsoft.com/office/drawing/2015/10/21/chartex" xmlns:cx3="http://schemas.microsoft.com/office/drawing/2016/5/9/chartex" xmlns:cx4="http://schemas.microsoft.com/office/drawing/2016/5/10/chartex" xmlns:cx5="http://schemas.microsoft.com/office/drawing/2016/5/11/chartex" xmlns:cx6="http://schemas.microsoft.com/office/drawing/2016/5/12/chartex" xmlns:cx7="http://schemas.microsoft.com/office/drawing/2016/5/13/chartex" xmlns:cx8="http://schemas.microsoft.com/office/drawing/2016/5/14/chartex" xmlns:mc="http://schemas.openxmlformats.org/markup-compatibility/2006" xmlns:aink="http://schemas.microsoft.com/office/drawing/2016/ink" xmlns:am3d="http://schemas.microsoft.com/office/drawing/2017/model3d" xmlns:o="urn:schemas-microsoft-com:office:office" xmlns:oel="http://schemas.microsoft.com/office/2019/extlst" xmlns:r="http://schemas.openxmlformats.org/officeDocument/2006/relationships" xmlns:m="http://schemas.openxmlformats.org/officeDocument/2006/math" xmlns:v="urn:schemas-microsoft-com:vml" xmlns:wp14="http://schemas.microsoft.com/office/word/2010/wordprocessingDrawing" xmlns:wp="http://schemas.openxmlformats.org/drawingml/2006/wordprocessingDrawing" xmlns:w10="urn:schemas-microsoft-com:office:word" xmlns:w="http://schemas.openxmlformats.org/wordprocessingml/2006/main" xmlns:w14="http://schemas.microsoft.com/office/word/2010/wordml" xmlns:w15="http://schemas.microsoft.com/office/word/2012/wordml" xmlns:w16cex="http://schemas.microsoft.com/office/word/2018/wordml/cex" xmlns:w16cid="http://schemas.microsoft.com/office/word/2016/wordml/cid" xmlns:w16="http://schemas.microsoft.com/office/word/2018/wordml" xmlns:w16du="http://schemas.microsoft.com/office/word/2023/wordml/word16du" xmlns:w16sdtdh="http://schemas.microsoft.com/office/word/2020/wordml/sdtdatahash" xmlns:w16sdtfl="http://schemas.microsoft.com/office/word/2024/wordml/sdtformatlock" xmlns:w16se="http://schemas.microsoft.com/office/word/2015/wordml/symex" xmlns:wpg="http://schemas.microsoft.com/office/word/2010/wordprocessingGroup" xmlns:wpi="http://schemas.microsoft.com/office/word/2010/wordprocessingInk" xmlns:wne="http://schemas.microsoft.com/office/word/2006/wordml" xmlns:wps="http://schemas.microsoft.com/office/word/2010/wordprocessingShape" mc:Ignorable="w14 w15 w16se w16cid w16 w16cex w16sdtdh w16sdtfl w16du wp14">
   <w:abstractNum w:abstractNumId="0" w15:restartNumberingAfterBreak="0">
     <w:nsid w:val="42503B21"/>
     <w:multiLevelType w:val="hybridMultilevel"/>
@@ -3370,23 +3493,23 @@
       </w:pPr>
     </w:lvl>
   </w:abstractNum>
-  <w:num w:numId="1">
+  <w:num w:numId="1" w16cid:durableId="719012293">
     <w:abstractNumId w:val="2"/>
   </w:num>
-  <w:num w:numId="2">
+  <w:num w:numId="2" w16cid:durableId="1364555736">
     <w:abstractNumId w:val="1"/>
   </w:num>
-  <w:num w:numId="3">
+  <w:num w:numId="3" w16cid:durableId="678582543">
     <w:abstractNumId w:val="3"/>
   </w:num>
-  <w:num w:numId="4">
+  <w:num w:numId="4" w16cid:durableId="1327173042">
     <w:abstractNumId w:val="0"/>
   </w:num>
 </w:numbering>
 </file>
 
 <file path=word/styles.xml><?xml version="1.0" encoding="utf-8"?>
-<w:styles xmlns:mc="http://schemas.openxmlformats.org/markup-compatibility/2006" xmlns:r="http://schemas.openxmlformats.org/officeDocument/2006/relationships" xmlns:w="http://schemas.openxmlformats.org/wordprocessingml/2006/main" xmlns:w14="http://schemas.microsoft.com/office/word/2010/wordml" xmlns:w15="http://schemas.microsoft.com/office/word/2012/wordml" xmlns:w16se="http://schemas.microsoft.com/office/word/2015/wordml/symex" mc:Ignorable="w14 w15 w16se">
+<w:styles xmlns:mc="http://schemas.openxmlformats.org/markup-compatibility/2006" xmlns:r="http://schemas.openxmlformats.org/officeDocument/2006/relationships" xmlns:w="http://schemas.openxmlformats.org/wordprocessingml/2006/main" xmlns:w14="http://schemas.microsoft.com/office/word/2010/wordml" xmlns:w15="http://schemas.microsoft.com/office/word/2012/wordml" xmlns:w16cex="http://schemas.microsoft.com/office/word/2018/wordml/cex" xmlns:w16cid="http://schemas.microsoft.com/office/word/2016/wordml/cid" xmlns:w16="http://schemas.microsoft.com/office/word/2018/wordml" xmlns:w16du="http://schemas.microsoft.com/office/word/2023/wordml/word16du" xmlns:w16sdtdh="http://schemas.microsoft.com/office/word/2020/wordml/sdtdatahash" xmlns:w16sdtfl="http://schemas.microsoft.com/office/word/2024/wordml/sdtformatlock" xmlns:w16se="http://schemas.microsoft.com/office/word/2015/wordml/symex" mc:Ignorable="w14 w15 w16se w16cid w16 w16cex w16sdtdh w16sdtfl w16du">
   <w:docDefaults>
     <w:rPrDefault>
       <w:rPr>
@@ -3399,7 +3522,7 @@
     </w:rPrDefault>
     <w:pPrDefault/>
   </w:docDefaults>
-  <w:latentStyles w:defLockedState="0" w:defUIPriority="99" w:defSemiHidden="0" w:defUnhideWhenUsed="0" w:defQFormat="0" w:count="371">
+  <w:latentStyles w:defLockedState="0" w:defUIPriority="99" w:defSemiHidden="0" w:defUnhideWhenUsed="0" w:defQFormat="0" w:count="376">
     <w:lsdException w:name="Normal" w:uiPriority="0" w:qFormat="1"/>
     <w:lsdException w:name="heading 1" w:uiPriority="9" w:qFormat="1"/>
     <w:lsdException w:name="heading 2" w:semiHidden="1" w:uiPriority="9" w:unhideWhenUsed="1" w:qFormat="1"/>
@@ -3771,8 +3894,13 @@
     <w:lsdException w:name="List Table 5 Dark Accent 6" w:uiPriority="50"/>
     <w:lsdException w:name="List Table 6 Colorful Accent 6" w:uiPriority="51"/>
     <w:lsdException w:name="List Table 7 Colorful Accent 6" w:uiPriority="52"/>
+    <w:lsdException w:name="Mention" w:semiHidden="1" w:unhideWhenUsed="1"/>
+    <w:lsdException w:name="Smart Hyperlink" w:semiHidden="1" w:unhideWhenUsed="1"/>
+    <w:lsdException w:name="Hashtag" w:semiHidden="1" w:unhideWhenUsed="1"/>
+    <w:lsdException w:name="Unresolved Mention" w:semiHidden="1" w:unhideWhenUsed="1"/>
+    <w:lsdException w:name="Smart Link" w:semiHidden="1" w:unhideWhenUsed="1"/>
   </w:latentStyles>
-  <w:style w:type="paragraph" w:default="1" w:styleId="a">
+  <w:style w:type="paragraph" w:default="1" w:styleId="Normal">
     <w:name w:val="Normal"/>
     <w:qFormat/>
     <w:pPr>
@@ -3780,11 +3908,11 @@
       <w:jc w:val="both"/>
     </w:pPr>
   </w:style>
-  <w:style w:type="paragraph" w:styleId="1">
+  <w:style w:type="paragraph" w:styleId="Heading1">
     <w:name w:val="heading 1"/>
-    <w:basedOn w:val="a"/>
-    <w:next w:val="a"/>
-    <w:link w:val="10"/>
+    <w:basedOn w:val="Normal"/>
+    <w:next w:val="Normal"/>
+    <w:link w:val="Heading1Char"/>
     <w:uiPriority w:val="9"/>
     <w:qFormat/>
     <w:rsid w:val="00DC2935"/>
@@ -3802,13 +3930,12 @@
       <w:szCs w:val="44"/>
     </w:rPr>
   </w:style>
-  <w:style w:type="character" w:default="1" w:styleId="a0">
+  <w:style w:type="character" w:default="1" w:styleId="DefaultParagraphFont">
     <w:name w:val="Default Paragraph Font"/>
     <w:uiPriority w:val="1"/>
-    <w:semiHidden/>
     <w:unhideWhenUsed/>
   </w:style>
-  <w:style w:type="table" w:default="1" w:styleId="a1">
+  <w:style w:type="table" w:default="1" w:styleId="TableNormal">
     <w:name w:val="Normal Table"/>
     <w:uiPriority w:val="99"/>
     <w:semiHidden/>
@@ -3823,16 +3950,16 @@
       </w:tblCellMar>
     </w:tblPr>
   </w:style>
-  <w:style w:type="numbering" w:default="1" w:styleId="a2">
+  <w:style w:type="numbering" w:default="1" w:styleId="NoList">
     <w:name w:val="No List"/>
     <w:uiPriority w:val="99"/>
     <w:semiHidden/>
     <w:unhideWhenUsed/>
   </w:style>
-  <w:style w:type="character" w:customStyle="1" w:styleId="10">
-    <w:name w:val="标题 1 字符"/>
-    <w:basedOn w:val="a0"/>
-    <w:link w:val="1"/>
+  <w:style w:type="character" w:customStyle="1" w:styleId="Heading1Char">
+    <w:name w:val="Heading 1 Char"/>
+    <w:basedOn w:val="DefaultParagraphFont"/>
+    <w:link w:val="Heading1"/>
     <w:uiPriority w:val="9"/>
     <w:rsid w:val="00DC2935"/>
     <w:rPr>
@@ -3843,9 +3970,9 @@
       <w:szCs w:val="44"/>
     </w:rPr>
   </w:style>
-  <w:style w:type="table" w:styleId="a3">
+  <w:style w:type="table" w:styleId="TableGrid">
     <w:name w:val="Table Grid"/>
-    <w:basedOn w:val="a1"/>
+    <w:basedOn w:val="TableNormal"/>
     <w:uiPriority w:val="39"/>
     <w:rsid w:val="00DC2935"/>
     <w:tblPr>
@@ -3859,9 +3986,9 @@
       </w:tblBorders>
     </w:tblPr>
   </w:style>
-  <w:style w:type="paragraph" w:styleId="a4">
+  <w:style w:type="paragraph" w:styleId="ListParagraph">
     <w:name w:val="List Paragraph"/>
-    <w:basedOn w:val="a"/>
+    <w:basedOn w:val="Normal"/>
     <w:uiPriority w:val="34"/>
     <w:qFormat/>
     <w:rsid w:val="003E7051"/>
@@ -3869,9 +3996,9 @@
       <w:ind w:firstLineChars="200" w:firstLine="420"/>
     </w:pPr>
   </w:style>
-  <w:style w:type="character" w:styleId="a5">
+  <w:style w:type="character" w:styleId="Hyperlink">
     <w:name w:val="Hyperlink"/>
-    <w:basedOn w:val="a0"/>
+    <w:basedOn w:val="DefaultParagraphFont"/>
     <w:uiPriority w:val="99"/>
     <w:unhideWhenUsed/>
     <w:rsid w:val="005337DA"/>

</xml_diff>